<commit_message>
Ref update with cluster, ignore dll files
</commit_message>
<xml_diff>
--- a/dev/octopus_calibration/ClimateCharacterization/ClimateCharacterization.docx
+++ b/dev/octopus_calibration/ClimateCharacterization/ClimateCharacterization.docx
@@ -1025,8 +1025,45 @@
                 <w:lang w:val="it-IT"/>
                 <w14:ligatures w14:val="none"/>
               </w:rPr>
-              <w:t>Udine, Arezzo, some inland valleys</w:t>
-            </w:r>
+              <w:t xml:space="preserve">Udine, Arezzo, some </w:t>
+            </w:r>
+            <w:proofErr w:type="spellStart"/>
+            <w:r>
+              <w:rPr>
+                <w:rFonts w:ascii="Times New Roman" w:eastAsia="Times New Roman" w:hAnsi="Times New Roman" w:cs="Times New Roman"/>
+                <w:kern w:val="0"/>
+                <w:sz w:val="20"/>
+                <w:szCs w:val="20"/>
+                <w:lang w:val="it-IT"/>
+                <w14:ligatures w14:val="none"/>
+              </w:rPr>
+              <w:t>inland</w:t>
+            </w:r>
+            <w:proofErr w:type="spellEnd"/>
+            <w:r>
+              <w:rPr>
+                <w:rFonts w:ascii="Times New Roman" w:eastAsia="Times New Roman" w:hAnsi="Times New Roman" w:cs="Times New Roman"/>
+                <w:kern w:val="0"/>
+                <w:sz w:val="20"/>
+                <w:szCs w:val="20"/>
+                <w:lang w:val="it-IT"/>
+                <w14:ligatures w14:val="none"/>
+              </w:rPr>
+              <w:t xml:space="preserve"> </w:t>
+            </w:r>
+            <w:proofErr w:type="spellStart"/>
+            <w:r>
+              <w:rPr>
+                <w:rFonts w:ascii="Times New Roman" w:eastAsia="Times New Roman" w:hAnsi="Times New Roman" w:cs="Times New Roman"/>
+                <w:kern w:val="0"/>
+                <w:sz w:val="20"/>
+                <w:szCs w:val="20"/>
+                <w:lang w:val="it-IT"/>
+                <w14:ligatures w14:val="none"/>
+              </w:rPr>
+              <w:t>valleys</w:t>
+            </w:r>
+            <w:proofErr w:type="spellEnd"/>
           </w:p>
         </w:tc>
       </w:tr>
@@ -1040,28 +1077,27 @@
     </w:p>
     <w:p>
       <w:r>
-        <w:rPr>
-          <w:highlight w:val="yellow"/>
-        </w:rPr>
         <w:t>Relative humidity not clear</w:t>
       </w:r>
       <w:r>
-        <w:rPr>
-          <w:highlight w:val="yellow"/>
-        </w:rPr>
-        <w:t>!</w:t>
-      </w:r>
-      <w:r>
-        <w:t xml:space="preserve"> </w:t>
-      </w:r>
-      <w:r>
-        <w:t>Considering the provincial distribution, this climatic variable does not appear reliable (</w:t>
-      </w:r>
+        <w:t xml:space="preserve">! </w:t>
+      </w:r>
+      <w:r>
+        <w:t>Considering</w:t>
+      </w:r>
+      <w:r>
+        <w:t xml:space="preserve"> the provincial distribution, this climatic variable does not appear reliable (</w:t>
+      </w:r>
+      <w:proofErr w:type="spellStart"/>
       <w:r>
         <w:t>e.g.,</w:t>
       </w:r>
       <w:r>
-        <w:t xml:space="preserve">Ravenna is not a dry province but rather a wet one). Moreover, relative humidity, </w:t>
+        <w:t>Ravenna</w:t>
+      </w:r>
+      <w:proofErr w:type="spellEnd"/>
+      <w:r>
+        <w:t xml:space="preserve"> is not a dry province but rather a wet one). Moreover, relative humidity, </w:t>
       </w:r>
       <w:r>
         <w:rPr>
@@ -2141,13 +2177,7 @@
         <w:spacing w:after="0"/>
       </w:pPr>
       <w:r>
-        <w:t>The first cluster (yellow) corresponds to colder areas with higher precipitation during spring and summer, reflecting the thermal and hydric regime typical of the Alpine regions</w:t>
-      </w:r>
-      <w:r>
-        <w:t xml:space="preserve"> (Sondrio)</w:t>
-      </w:r>
-      <w:r>
-        <w:t>, characterized by cold winters and comparatively wetter warm seasons.</w:t>
+        <w:t>The first cluster (yellow) corresponds to colder areas with higher precipitation during spring and summer, reflecting the thermal and hydric regime typical of the Alpine regions (Sondrio), characterized by cold winters and comparatively wetter warm seasons.</w:t>
       </w:r>
     </w:p>
     <w:p>
@@ -2353,10 +2383,10 @@
         </w:rPr>
         <w:lastRenderedPageBreak/>
         <w:drawing>
-          <wp:inline distT="0" distB="0" distL="0" distR="0" wp14:anchorId="5DD60DCB" wp14:editId="0D131833">
+          <wp:inline distT="0" distB="0" distL="0" distR="0" wp14:anchorId="5A54EF0D" wp14:editId="4D0B1994">
             <wp:extent cx="5943600" cy="4457700"/>
             <wp:effectExtent l="0" t="0" r="0" b="0"/>
-            <wp:docPr id="1579133750" name="Picture 3" descr="A map of italy with different colored dots&#10;&#10;AI-generated content may be incorrect."/>
+            <wp:docPr id="1774190502" name="Picture 2" descr="A map of italy with colored dots&#10;&#10;AI-generated content may be incorrect."/>
             <wp:cNvGraphicFramePr>
               <a:graphicFrameLocks xmlns:a="http://schemas.openxmlformats.org/drawingml/2006/main" noChangeAspect="1"/>
             </wp:cNvGraphicFramePr>
@@ -2364,7 +2394,7 @@
               <a:graphicData uri="http://schemas.openxmlformats.org/drawingml/2006/picture">
                 <pic:pic xmlns:pic="http://schemas.openxmlformats.org/drawingml/2006/picture">
                   <pic:nvPicPr>
-                    <pic:cNvPr id="1579133750" name="Picture 3" descr="A map of italy with different colored dots&#10;&#10;AI-generated content may be incorrect."/>
+                    <pic:cNvPr id="1774190502" name="Picture 2" descr="A map of italy with colored dots&#10;&#10;AI-generated content may be incorrect."/>
                     <pic:cNvPicPr/>
                   </pic:nvPicPr>
                   <pic:blipFill>
@@ -3008,6 +3038,7 @@
   <w:style w:type="character" w:default="1" w:styleId="DefaultParagraphFont">
     <w:name w:val="Default Paragraph Font"/>
     <w:uiPriority w:val="1"/>
+    <w:semiHidden/>
     <w:unhideWhenUsed/>
   </w:style>
   <w:style w:type="table" w:default="1" w:styleId="TableNormal">

</xml_diff>